<commit_message>
feat: experiment with wireframe-based journal and history UI
</commit_message>
<xml_diff>
--- a/docs/AI_Journal_Companion_Test_Report.docx
+++ b/docs/AI_Journal_Companion_Test_Report.docx
@@ -2680,10 +2680,174 @@
           </w:p>
         </w:tc>
       </w:tr>
+      <w:tr>
+        <w:trPr>
+          <w:cantSplit/>
+        </w:trPr>
+        <w:tc>
+          <w:tcPr>
+            <w:tcW w:w="1160" w:type="dxa"/>
+          </w:tcPr>
+          <w:p>
+            <w:pPr>
+              <w:rPr>
+                <w:rFonts w:eastAsia="Calibri"/>
+              </w:rPr>
+            </w:pPr>
+            <w:r>
+              <w:t xml:space="preserve">TC-26</w:t>
+            </w:r>
+          </w:p>
+        </w:tc>
+        <w:tc>
+          <w:tcPr>
+            <w:tcW w:w="2975" w:type="dxa"/>
+          </w:tcPr>
+          <w:p>
+            <w:pPr>
+              <w:jc w:val="center"/>
+              <w:rPr>
+                <w:rFonts w:eastAsia="Calibri"/>
+              </w:rPr>
+            </w:pPr>
+            <w:r>
+              <w:t xml:space="preserve">Journal / History navigation</w:t>
+            </w:r>
+          </w:p>
+        </w:tc>
+        <w:tc>
+          <w:tcPr>
+            <w:tcW w:w="1980" w:type="dxa"/>
+            <w:gridSpan w:val="2"/>
+          </w:tcPr>
+          <w:p>
+            <w:pPr>
+              <w:rPr>
+                <w:rFonts w:eastAsia="Calibri"/>
+              </w:rPr>
+            </w:pPr>
+            <w:r>
+              <w:t xml:space="preserve">Keep draft and reflection on tab changes.</w:t>
+            </w:r>
+          </w:p>
+        </w:tc>
+        <w:tc>
+          <w:tcPr>
+            <w:tcW w:w="1972" w:type="dxa"/>
+          </w:tcPr>
+          <w:p>
+            <w:pPr>
+              <w:rPr>
+                <w:rFonts w:eastAsia="Calibri"/>
+              </w:rPr>
+            </w:pPr>
+            <w:r>
+              <w:t xml:space="preserve">Draft, advice and selected tab retained.</w:t>
+            </w:r>
+          </w:p>
+        </w:tc>
+        <w:tc>
+          <w:tcPr>
+            <w:tcW w:w="929" w:type="dxa"/>
+          </w:tcPr>
+          <w:p>
+            <w:pPr>
+              <w:rPr>
+                <w:rFonts w:eastAsia="Calibri"/>
+              </w:rPr>
+            </w:pPr>
+            <w:r>
+              <w:t xml:space="preserve">Pass</w:t>
+            </w:r>
+          </w:p>
+        </w:tc>
+      </w:tr>
+      <w:tr>
+        <w:trPr>
+          <w:cantSplit/>
+        </w:trPr>
+        <w:tc>
+          <w:tcPr>
+            <w:tcW w:w="1160" w:type="dxa"/>
+          </w:tcPr>
+          <w:p>
+            <w:pPr>
+              <w:rPr>
+                <w:rFonts w:eastAsia="Calibri"/>
+              </w:rPr>
+            </w:pPr>
+            <w:r>
+              <w:t xml:space="preserve">TC-27</w:t>
+            </w:r>
+          </w:p>
+        </w:tc>
+        <w:tc>
+          <w:tcPr>
+            <w:tcW w:w="2975" w:type="dxa"/>
+          </w:tcPr>
+          <w:p>
+            <w:pPr>
+              <w:jc w:val="center"/>
+              <w:rPr>
+                <w:rFonts w:eastAsia="Calibri"/>
+              </w:rPr>
+            </w:pPr>
+            <w:r>
+              <w:t xml:space="preserve">Inactive future controls (UI)</w:t>
+            </w:r>
+          </w:p>
+        </w:tc>
+        <w:tc>
+          <w:tcPr>
+            <w:tcW w:w="1980" w:type="dxa"/>
+            <w:gridSpan w:val="2"/>
+          </w:tcPr>
+          <w:p>
+            <w:pPr>
+              <w:rPr>
+                <w:rFonts w:eastAsia="Calibri"/>
+              </w:rPr>
+            </w:pPr>
+            <w:r>
+              <w:t xml:space="preserve">Disable future feature controls.</w:t>
+            </w:r>
+          </w:p>
+        </w:tc>
+        <w:tc>
+          <w:tcPr>
+            <w:tcW w:w="1972" w:type="dxa"/>
+          </w:tcPr>
+          <w:p>
+            <w:pPr>
+              <w:rPr>
+                <w:rFonts w:eastAsia="Calibri"/>
+              </w:rPr>
+            </w:pPr>
+            <w:r>
+              <w:t xml:space="preserve">All future controls disabled.</w:t>
+            </w:r>
+          </w:p>
+        </w:tc>
+        <w:tc>
+          <w:tcPr>
+            <w:tcW w:w="929" w:type="dxa"/>
+          </w:tcPr>
+          <w:p>
+            <w:pPr>
+              <w:rPr>
+                <w:rFonts w:eastAsia="Calibri"/>
+              </w:rPr>
+            </w:pPr>
+            <w:r>
+              <w:t xml:space="preserve">Pass</w:t>
+            </w:r>
+          </w:p>
+        </w:tc>
+      </w:tr>
     </w:tbl>
     <w:p>
       <w:r>
-        <w:t xml:space="preserve">Recorded passes: 16 backend. History retest: 16 Android unit and 15 emulator tests. Future features are Not run. Build: a09afd8 + uncommitted history.</w:t>
+        <w:t xml:space="preserve">Recorded: 16 backend passes. UI retest: 16 Android unit and 17 emulator passes. Future features are Not run. Build: ec8d69e + UI working tree.</w:t>
       </w:r>
     </w:p>
     <w:p>

</xml_diff>